<commit_message>
lab report changed: + conclusion
</commit_message>
<xml_diff>
--- a/lab_report.docx
+++ b/lab_report.docx
@@ -386,7 +386,7 @@
       <w:pPr>
         <w:pStyle w:val="Normal"/>
         <w:spacing w:lineRule="auto" w:line="288" w:before="120" w:after="160"/>
-        <w:ind w:left="5040"/>
+        <w:ind w:firstLine="709" w:left="5040"/>
         <w:rPr>
           <w:rFonts w:ascii="Times New Roman" w:hAnsi="Times New Roman" w:eastAsia="Calibri" w:cs="Times New Roman"/>
           <w:sz w:val="24"/>
@@ -407,15 +407,7 @@
           <w:sz w:val="24"/>
           <w:szCs w:val="24"/>
         </w:rPr>
-        <w:t xml:space="preserve">Автор: </w:t>
-      </w:r>
-      <w:r>
-        <w:rPr>
-          <w:rFonts w:eastAsia="Calibri" w:cs="Times New Roman"/>
-          <w:sz w:val="24"/>
-          <w:szCs w:val="24"/>
-        </w:rPr>
-        <w:t>Гулякин Илья Александрович</w:t>
+        <w:t>Автор: Гулякин Илья Александрович</w:t>
       </w:r>
     </w:p>
     <w:p>
@@ -475,16 +467,7 @@
           <w:szCs w:val="24"/>
           <w:lang w:val="en-US"/>
         </w:rPr>
-        <w:t>M310</w:t>
-      </w:r>
-      <w:r>
-        <w:rPr>
-          <w:rFonts w:eastAsia="Calibri" w:cs="Times New Roman"/>
-          <w:sz w:val="24"/>
-          <w:szCs w:val="24"/>
-          <w:lang w:val="en-US"/>
-        </w:rPr>
-        <w:t>2</w:t>
+        <w:t>M3102</w:t>
       </w:r>
     </w:p>
     <w:p>
@@ -517,9 +500,7 @@
         </w:rPr>
       </w:pPr>
       <w:r>
-        <w:rPr>
-          <w:b w:val="false"/>
-        </w:rPr>
+        <w:rPr/>
         <w:drawing>
           <wp:inline distT="0" distB="0" distL="0" distR="0">
             <wp:extent cx="3079750" cy="1283970"/>
@@ -559,8 +540,8 @@
           </wp:inline>
         </w:drawing>
       </w:r>
-      <w:bookmarkStart w:id="4" w:name="_3ezesmttxiys"/>
-      <w:bookmarkStart w:id="5" w:name="_1upicxv98uyu"/>
+      <w:bookmarkStart w:id="4" w:name="_1upicxv98uyu"/>
+      <w:bookmarkStart w:id="5" w:name="_3ezesmttxiys"/>
       <w:bookmarkEnd w:id="4"/>
       <w:bookmarkEnd w:id="5"/>
       <w:r>
@@ -601,7 +582,7 @@
       </w:pPr>
       <w:r>
         <w:drawing>
-          <wp:anchor behindDoc="0" distT="0" distB="0" distL="0" distR="0" simplePos="0" locked="0" layoutInCell="0" allowOverlap="1" relativeHeight="2">
+          <wp:anchor behindDoc="0" distT="0" distB="0" distL="0" distR="0" simplePos="0" locked="0" layoutInCell="0" allowOverlap="1" relativeHeight="3">
             <wp:simplePos x="0" y="0"/>
             <wp:positionH relativeFrom="column">
               <wp:align>center</wp:align>
@@ -671,7 +652,7 @@
       </w:pPr>
       <w:r>
         <w:drawing>
-          <wp:anchor behindDoc="0" distT="0" distB="0" distL="0" distR="0" simplePos="0" locked="0" layoutInCell="0" allowOverlap="1" relativeHeight="3">
+          <wp:anchor behindDoc="0" distT="0" distB="0" distL="0" distR="0" simplePos="0" locked="0" layoutInCell="0" allowOverlap="1" relativeHeight="4">
             <wp:simplePos x="0" y="0"/>
             <wp:positionH relativeFrom="column">
               <wp:align>center</wp:align>
@@ -743,7 +724,7 @@
       </w:pPr>
       <w:r>
         <w:drawing>
-          <wp:anchor behindDoc="0" distT="0" distB="0" distL="0" distR="0" simplePos="0" locked="0" layoutInCell="0" allowOverlap="1" relativeHeight="4">
+          <wp:anchor behindDoc="0" distT="0" distB="0" distL="0" distR="0" simplePos="0" locked="0" layoutInCell="0" allowOverlap="1" relativeHeight="5">
             <wp:simplePos x="0" y="0"/>
             <wp:positionH relativeFrom="column">
               <wp:align>center</wp:align>
@@ -813,7 +794,7 @@
       </w:pPr>
       <w:r>
         <w:drawing>
-          <wp:anchor behindDoc="0" distT="0" distB="0" distL="0" distR="0" simplePos="0" locked="0" layoutInCell="0" allowOverlap="1" relativeHeight="5">
+          <wp:anchor behindDoc="0" distT="0" distB="0" distL="0" distR="0" simplePos="0" locked="0" layoutInCell="0" allowOverlap="1" relativeHeight="6">
             <wp:simplePos x="0" y="0"/>
             <wp:positionH relativeFrom="column">
               <wp:align>center</wp:align>
@@ -886,7 +867,7 @@
       </w:pPr>
       <w:r>
         <w:drawing>
-          <wp:anchor behindDoc="0" distT="0" distB="0" distL="0" distR="0" simplePos="0" locked="0" layoutInCell="0" allowOverlap="1" relativeHeight="6">
+          <wp:anchor behindDoc="0" distT="0" distB="0" distL="0" distR="0" simplePos="0" locked="0" layoutInCell="0" allowOverlap="1" relativeHeight="7">
             <wp:simplePos x="0" y="0"/>
             <wp:positionH relativeFrom="column">
               <wp:align>center</wp:align>
@@ -932,7 +913,7 @@
           </wp:anchor>
         </w:drawing>
         <w:drawing>
-          <wp:anchor behindDoc="0" distT="0" distB="0" distL="0" distR="0" simplePos="0" locked="0" layoutInCell="0" allowOverlap="1" relativeHeight="8">
+          <wp:anchor behindDoc="0" distT="0" distB="0" distL="0" distR="0" simplePos="0" locked="0" layoutInCell="0" allowOverlap="1" relativeHeight="9">
             <wp:simplePos x="0" y="0"/>
             <wp:positionH relativeFrom="column">
               <wp:posOffset>5715</wp:posOffset>
@@ -1025,7 +1006,7 @@
       </w:pPr>
       <w:r>
         <w:drawing>
-          <wp:anchor behindDoc="0" distT="0" distB="0" distL="0" distR="0" simplePos="0" locked="0" layoutInCell="0" allowOverlap="1" relativeHeight="7">
+          <wp:anchor behindDoc="0" distT="0" distB="0" distL="0" distR="0" simplePos="0" locked="0" layoutInCell="0" allowOverlap="1" relativeHeight="8">
             <wp:simplePos x="0" y="0"/>
             <wp:positionH relativeFrom="column">
               <wp:posOffset>0</wp:posOffset>
@@ -1095,7 +1076,7 @@
       </w:pPr>
       <w:r>
         <w:drawing>
-          <wp:anchor behindDoc="0" distT="0" distB="0" distL="0" distR="0" simplePos="0" locked="0" layoutInCell="0" allowOverlap="1" relativeHeight="9">
+          <wp:anchor behindDoc="0" distT="0" distB="0" distL="0" distR="0" simplePos="0" locked="0" layoutInCell="0" allowOverlap="1" relativeHeight="10">
             <wp:simplePos x="0" y="0"/>
             <wp:positionH relativeFrom="column">
               <wp:align>center</wp:align>
@@ -1165,7 +1146,7 @@
       </w:pPr>
       <w:r>
         <w:drawing>
-          <wp:anchor behindDoc="0" distT="0" distB="0" distL="0" distR="0" simplePos="0" locked="0" layoutInCell="0" allowOverlap="1" relativeHeight="10">
+          <wp:anchor behindDoc="0" distT="0" distB="0" distL="0" distR="0" simplePos="0" locked="0" layoutInCell="0" allowOverlap="1" relativeHeight="11">
             <wp:simplePos x="0" y="0"/>
             <wp:positionH relativeFrom="column">
               <wp:align>center</wp:align>
@@ -1236,7 +1217,7 @@
       <w:r>
         <w:rPr/>
         <w:drawing>
-          <wp:anchor behindDoc="0" distT="0" distB="0" distL="0" distR="0" simplePos="0" locked="0" layoutInCell="0" allowOverlap="1" relativeHeight="11">
+          <wp:anchor behindDoc="0" distT="0" distB="0" distL="0" distR="0" simplePos="0" locked="0" layoutInCell="0" allowOverlap="1" relativeHeight="12">
             <wp:simplePos x="0" y="0"/>
             <wp:positionH relativeFrom="column">
               <wp:posOffset>-5715</wp:posOffset>
@@ -1282,7 +1263,7 @@
           </wp:anchor>
         </w:drawing>
         <w:drawing>
-          <wp:anchor behindDoc="0" distT="0" distB="0" distL="0" distR="0" simplePos="0" locked="0" layoutInCell="0" allowOverlap="1" relativeHeight="14">
+          <wp:anchor behindDoc="0" distT="0" distB="0" distL="0" distR="0" simplePos="0" locked="0" layoutInCell="0" allowOverlap="1" relativeHeight="15">
             <wp:simplePos x="0" y="0"/>
             <wp:positionH relativeFrom="column">
               <wp:posOffset>-5715</wp:posOffset>
@@ -1401,7 +1382,7 @@
       <w:r>
         <w:rPr/>
         <w:drawing>
-          <wp:anchor behindDoc="0" distT="0" distB="0" distL="0" distR="0" simplePos="0" locked="0" layoutInCell="0" allowOverlap="1" relativeHeight="12">
+          <wp:anchor behindDoc="0" distT="0" distB="0" distL="0" distR="0" simplePos="0" locked="0" layoutInCell="0" allowOverlap="1" relativeHeight="13">
             <wp:simplePos x="0" y="0"/>
             <wp:positionH relativeFrom="column">
               <wp:posOffset>17780</wp:posOffset>
@@ -1518,7 +1499,7 @@
       </w:pPr>
       <w:r>
         <w:drawing>
-          <wp:anchor behindDoc="0" distT="0" distB="0" distL="0" distR="0" simplePos="0" locked="0" layoutInCell="0" allowOverlap="1" relativeHeight="13">
+          <wp:anchor behindDoc="0" distT="0" distB="0" distL="0" distR="0" simplePos="0" locked="0" layoutInCell="0" allowOverlap="1" relativeHeight="14">
             <wp:simplePos x="0" y="0"/>
             <wp:positionH relativeFrom="column">
               <wp:align>center</wp:align>
@@ -1567,6 +1548,115 @@
       <w:r>
         <w:rPr/>
         <w:t>На скриншоте видная моя ошибка при первой попытке подсоежинения созданного мною github репозитория, я попытался подвязать его как origin, но как говорилось ранее origin уже существует.</w:t>
+      </w:r>
+    </w:p>
+    <w:p>
+      <w:pPr>
+        <w:pStyle w:val="Normal"/>
+        <w:spacing w:before="0" w:after="0"/>
+        <w:ind w:hanging="0" w:left="0"/>
+        <w:jc w:val="both"/>
+        <w:rPr/>
+      </w:pPr>
+      <w:r>
+        <w:rPr/>
+      </w:r>
+    </w:p>
+    <w:p>
+      <w:pPr>
+        <w:pStyle w:val="Normal"/>
+        <w:spacing w:before="0" w:after="0"/>
+        <w:ind w:hanging="0" w:left="0"/>
+        <w:jc w:val="both"/>
+        <w:rPr/>
+      </w:pPr>
+      <w:r>
+        <w:rPr>
+          <w:b/>
+          <w:bCs/>
+        </w:rPr>
+        <w:t>13.</w:t>
+      </w:r>
+      <w:r>
+        <w:rPr/>
+        <w:t xml:space="preserve"> Вывод.</w:t>
+      </w:r>
+    </w:p>
+    <w:p>
+      <w:pPr>
+        <w:pStyle w:val="Normal"/>
+        <w:spacing w:before="0" w:after="0"/>
+        <w:ind w:hanging="0" w:left="0"/>
+        <w:jc w:val="both"/>
+        <w:rPr/>
+      </w:pPr>
+      <w:r>
+        <w:rPr/>
+        <w:t>Научился работать с распределенной системой контроля версий git, а именно:</w:t>
+      </w:r>
+    </w:p>
+    <w:p>
+      <w:pPr>
+        <w:pStyle w:val="Normal"/>
+        <w:spacing w:before="0" w:after="0"/>
+        <w:ind w:hanging="0" w:left="0"/>
+        <w:jc w:val="both"/>
+        <w:rPr/>
+      </w:pPr>
+      <w:r>
+        <w:rPr/>
+        <w:t>- Клонировать удаленный репозиторий с GitHub.</w:t>
+      </w:r>
+    </w:p>
+    <w:p>
+      <w:pPr>
+        <w:pStyle w:val="Normal"/>
+        <w:spacing w:before="0" w:after="0"/>
+        <w:ind w:hanging="0" w:left="0"/>
+        <w:jc w:val="both"/>
+        <w:rPr/>
+      </w:pPr>
+      <w:r>
+        <w:rPr/>
+        <w:t>- Создавать отдельную ветку и работать в ней</w:t>
+      </w:r>
+    </w:p>
+    <w:p>
+      <w:pPr>
+        <w:pStyle w:val="Normal"/>
+        <w:spacing w:before="0" w:after="0"/>
+        <w:ind w:hanging="0" w:left="0"/>
+        <w:jc w:val="both"/>
+        <w:rPr/>
+      </w:pPr>
+      <w:r>
+        <w:rPr/>
+        <w:t>- Анализировать разницу между коммитами</w:t>
+      </w:r>
+    </w:p>
+    <w:p>
+      <w:pPr>
+        <w:pStyle w:val="Normal"/>
+        <w:spacing w:before="0" w:after="0"/>
+        <w:ind w:hanging="0" w:left="0"/>
+        <w:jc w:val="both"/>
+        <w:rPr/>
+      </w:pPr>
+      <w:r>
+        <w:rPr/>
+        <w:t>- Строить графы истории</w:t>
+      </w:r>
+    </w:p>
+    <w:p>
+      <w:pPr>
+        <w:pStyle w:val="Normal"/>
+        <w:spacing w:before="0" w:after="0"/>
+        <w:ind w:hanging="0" w:left="0"/>
+        <w:jc w:val="both"/>
+        <w:rPr/>
+      </w:pPr>
+      <w:r>
+        <w:rPr/>
       </w:r>
     </w:p>
     <w:sectPr>

</xml_diff>